<commit_message>
Shorten answer to 1f
Co-Authored-By: Claude Opus 5.5 <noreply@anthropic.com>
Claude-Session: https://claude.ai/code/session_01NjEWNQdXQ3JLdCxrjcyMs5
</commit_message>
<xml_diff>
--- a/eco110/ECO110_Assignment2_answers.docx
+++ b/eco110/ECO110_Assignment2_answers.docx
@@ -146,13 +146,10 @@
     </w:p>
     <w:p>
       <w:r>
-        <w:t>A price ceiling. A ceiling is a legal maximum price; if it is set below equilibrium it makes tablets cheaper, so schools and students can afford them. A price floor is a legal minimum and would raise the price, which discourages use.</w:t>
+        <w:t>A price ceiling, because it sets a maximum price below equilibrium, which makes tablets cheaper for schools. A price floor would raise the price and discourage use.</w:t>
         <w:br/>
         <w:br/>
-        <w:t>The ceiling should be placed between $400 and $800. It must be below $800, because a ceiling above the equilibrium price is non-binding and changes nothing. It must be above $400, because $400 is the lowest price at which producers supply anything (Qs = 0 at P = 400); below $400 no tablets would be produced at all.</w:t>
-        <w:br/>
-        <w:br/>
-        <w:t>Note: a binding ceiling creates a shortage. At a ceiling of $600, Qd = 600 but Qs = 200, so only 200 tablets are actually sold (fewer than the 400 at equilibrium). The policy makes tablets cheaper for those who get one, but it does not increase the number of tablets in use.</w:t>
+        <w:t>It should be placed between $400 and $800. It must be below $800 (the equilibrium price), otherwise it has no effect. It must be above $400, because below that price producers supply nothing (Qs = 0 at P = 400).</w:t>
       </w:r>
     </w:p>
     <w:p>

</xml_diff>

<commit_message>
Use absolute values and show full working for elasticity answers
Co-Authored-By: Claude Opus 5.5 <noreply@anthropic.com>
Claude-Session: https://claude.ai/code/session_01NjEWNQdXQ3JLdCxrjcyMs5
</commit_message>
<xml_diff>
--- a/eco110/ECO110_Assignment2_answers.docx
+++ b/eco110/ECO110_Assignment2_answers.docx
@@ -182,21 +182,23 @@
     </w:p>
     <w:p>
       <w:r>
-        <w:t>Midpoint (arc) method:</w:t>
+        <w:t>Formula (midpoint method, absolute values):</w:t>
         <w:br/>
-        <w:t>%ΔQ = (4.2 − 2.3) / [(4.2 + 2.3)/2] = 1.9 / 3.25 = 58.46%</w:t>
-        <w:br/>
-        <w:t>%ΔP = (5.00 − 7.50) / [(5.00 + 7.50)/2] = −2.50 / 6.25 = −40.00%</w:t>
-        <w:br/>
-        <w:t>Ed = 58.46% / −40.00% = −1.46  →  |Ed| = 1.46 &gt; 1, so demand is ELASTIC.</w:t>
-        <w:br/>
-        <w:t>(Simple percentage method from the original values: 82.6% / −33.3% = −2.48, also elastic.)</w:t>
+        <w:t>Ed = |%ΔQ| / |%ΔP|</w:t>
         <w:br/>
         <w:br/>
-        <w:t>Check with total revenue: before = $7.50 × 2.3M = $17.25M per day; after = $5.00 × 4.2M = $21.0M per day. Revenue rose when the price fell, which is what happens when demand is elastic.</w:t>
+        <w:t>%ΔQ = (4.2 − 2.3) / [(4.2 + 2.3) / 2] = 1.9 / 3.25 = 0.5846 = 58.46%</w:t>
+        <w:br/>
+        <w:t>%ΔP = (5.00 − 7.50) / [(5.00 + 7.50) / 2] = 2.50 / 6.25 = 0.40 = 40%  (absolute value)</w:t>
         <w:br/>
         <w:br/>
-        <w:t>What this says about subs and other products: elastic demand means Foot Longs have many close substitutes, such as subs from Jimmy John's, Jersey Mike's or Quiznos, fast-food burgers, pizza, or a sandwich made at home. Consumers are price-sensitive: when Subway cuts its price, many customers switch to Subway from these substitutes. A Foot Long is also a non-essential purchase, which makes demand more elastic.</w:t>
+        <w:t>Ed = 58.46% / 40% = 1.46</w:t>
+        <w:br/>
+        <w:br/>
+        <w:t>Since 1.46 &gt; 1, demand is ELASTIC.</w:t>
+        <w:br/>
+        <w:br/>
+        <w:t>This means Foot Long subs have many close substitutes (other sub shops, fast food, homemade sandwiches). Customers are price-sensitive, so when Subway lowered its price, many switched to Subway from those substitutes.</w:t>
       </w:r>
     </w:p>
     <w:p>
@@ -239,11 +241,11 @@
         <w:br/>
         <w:t>%ΔQ = (5,000 − 2,000) / 3,500 = 85.7%</w:t>
         <w:br/>
-        <w:t>%ΔP = (2.99 − 4.99) / 3.99 = −50.1%</w:t>
+        <w:t>%ΔP = |2.99 − 4.99| / 3.99 = 2.00 / 3.99 = 50.1%</w:t>
         <w:br/>
-        <w:t>Ed = 85.7% / −50.1% = −1.71  →  |Ed| = 1.71 &gt; 1, so demand is ELASTIC.</w:t>
+        <w:t>Ed = 85.7% / 50.1% = 1.71</w:t>
         <w:br/>
-        <w:t>(Simple method: 150% / −40.1% = −3.74, also elastic.)</w:t>
+        <w:t>Since 1.71 &gt; 1, demand is ELASTIC.</w:t>
       </w:r>
     </w:p>
     <w:p>
@@ -326,13 +328,13 @@
       <w:r>
         <w:t>Midpoint method:</w:t>
         <w:br/>
-        <w:t>%ΔQ = (5M − 10M) / 7.5M = −66.7%</w:t>
+        <w:t>%ΔQ = |5M − 10M| / 7.5M = 5M / 7.5M = 66.7%</w:t>
         <w:br/>
-        <w:t>%ΔP = (3.20 − 3.00) / 3.10 = 6.45%</w:t>
+        <w:t>%ΔP = (3.20 − 3.00) / 3.10 = 0.20 / 3.10 = 6.45%</w:t>
         <w:br/>
-        <w:t>Ed = −66.7% / 6.45% = −10.33  →  |Ed| = 10.33, so demand is HIGHLY ELASTIC.</w:t>
+        <w:t>Ed = 66.7% / 6.45% = 10.33</w:t>
         <w:br/>
-        <w:t>(Simple method: −50% / 6.67% = −7.5, also highly elastic.)</w:t>
+        <w:t>Since 10.33 &gt; 1, demand is HIGHLY ELASTIC.</w:t>
       </w:r>
     </w:p>
     <w:p>
@@ -410,7 +412,7 @@
     </w:p>
     <w:p>
       <w:r>
-        <w:t>The tax burden falls mostly on whichever side of the market is less elastic, meaning less able to walk away. Here demand is highly elastic (|Ed| ≈ 10) and the demand curve is much flatter than the supply curve.</w:t>
+        <w:t>The tax burden falls mostly on whichever side of the market is less elastic, meaning less able to walk away. Here demand is highly elastic (Ed ≈ 10.33) and the demand curve is much flatter than the supply curve.</w:t>
         <w:br/>
         <w:br/>
         <w:t>Consumers have many substitutes for energy drinks: coffee, tea, soda and caffeine pills. Energy drinks are also not a necessity. If producers tried to pass the full $1.00 on to consumers by raising the price to $4.00, quantity demanded would fall sharply because consumers would switch to those alternatives.</w:t>

</xml_diff>